<commit_message>
feat(results): link headline figures and banner to ticked ECM selection
Lifted the ECM checkbox selection state from ActionPlanChart into
ResultsHero so that all headline numbers (year-1 saving, monthly saved,
10-year projection, CO2e avoided, month-to-month banner) scale
proportionally with whichever measures the user ticks. Previously these
figures were static and always showed the full ECM set regardless of
what was ticked in the chart.
</commit_message>
<xml_diff>
--- a/PEAK_Calculator_Report.docx
+++ b/PEAK_Calculator_Report.docx
@@ -754,7 +754,7 @@
           <w:sz w:val="21"/>
           <w:szCs w:val="21"/>
         </w:rPr>
-        <w:t xml:space="preserve">Nine issues were found and fixed during build-and-test iteration, tagged by severity (H = high, M = moderate, L = low) and tracked inline in the codebase so every subsequent change can be checked against them:</w:t>
+        <w:t>Twelve issues were found and fixed during build-and-test iteration, tagged by severity (H = high, M = moderate, L = low) and tracked inline in the codebase so every subsequent change can be checked against them:</w:t>
       </w:r>
     </w:p>
     <w:tbl>
@@ -1818,6 +1818,320 @@
           </w:p>
         </w:tc>
       </w:tr>
+      <w:tr>
+        <w:tc>
+          <w:tcPr>
+            <w:tcW w:type="dxa" w:w="700"/>
+            <w:shd w:fill="F2F5F1" w:val="clear"/>
+            <w:tcMar>
+              <w:top w:type="dxa" w:w="90"/>
+              <w:left w:type="dxa" w:w="110"/>
+              <w:bottom w:type="dxa" w:w="90"/>
+              <w:right w:type="dxa" w:w="110"/>
+            </w:tcMar>
+            <w:vAlign w:val="center"/>
+          </w:tcPr>
+          <w:p>
+            <w:r>
+              <w:rPr>
+                <w:rFonts w:ascii="Calibri" w:cs="Calibri" w:eastAsia="Calibri" w:hAnsi="Calibri"/>
+                <w:b w:val="false"/>
+                <w:bCs w:val="false"/>
+                <w:color w:val="1A1A1A"/>
+                <w:sz w:val="19"/>
+                <w:szCs w:val="19"/>
+              </w:rPr>
+              <w:t>M7</w:t>
+            </w:r>
+          </w:p>
+        </w:tc>
+        <w:tc>
+          <w:tcPr>
+            <w:tcW w:type="dxa" w:w="1100"/>
+            <w:shd w:fill="F2F5F1" w:val="clear"/>
+            <w:tcMar>
+              <w:top w:type="dxa" w:w="90"/>
+              <w:left w:type="dxa" w:w="110"/>
+              <w:bottom w:type="dxa" w:w="90"/>
+              <w:right w:type="dxa" w:w="110"/>
+            </w:tcMar>
+            <w:vAlign w:val="center"/>
+          </w:tcPr>
+          <w:p>
+            <w:r>
+              <w:rPr>
+                <w:rFonts w:ascii="Calibri" w:cs="Calibri" w:eastAsia="Calibri" w:hAnsi="Calibri"/>
+                <w:b w:val="false"/>
+                <w:bCs w:val="false"/>
+                <w:color w:val="1A1A1A"/>
+                <w:sz w:val="19"/>
+                <w:szCs w:val="19"/>
+              </w:rPr>
+              <w:t>Moderate</w:t>
+            </w:r>
+          </w:p>
+        </w:tc>
+        <w:tc>
+          <w:tcPr>
+            <w:tcW w:type="dxa" w:w="2600"/>
+            <w:shd w:fill="F2F5F1" w:val="clear"/>
+            <w:tcMar>
+              <w:top w:type="dxa" w:w="90"/>
+              <w:left w:type="dxa" w:w="110"/>
+              <w:bottom w:type="dxa" w:w="90"/>
+              <w:right w:type="dxa" w:w="110"/>
+            </w:tcMar>
+            <w:vAlign w:val="center"/>
+          </w:tcPr>
+          <w:p>
+            <w:r>
+              <w:rPr>
+                <w:rFonts w:ascii="Calibri" w:cs="Calibri" w:eastAsia="Calibri" w:hAnsi="Calibri"/>
+                <w:b w:val="false"/>
+                <w:bCs w:val="false"/>
+                <w:color w:val="1A1A1A"/>
+                <w:sz w:val="19"/>
+                <w:szCs w:val="19"/>
+              </w:rPr>
+              <w:t>Chart's Y-axis auto-scaled to whatever was ticked</w:t>
+            </w:r>
+          </w:p>
+        </w:tc>
+        <w:tc>
+          <w:tcPr>
+            <w:tcW w:type="dxa" w:w="5200"/>
+            <w:shd w:fill="F2F5F1" w:val="clear"/>
+            <w:tcMar>
+              <w:top w:type="dxa" w:w="90"/>
+              <w:left w:type="dxa" w:w="110"/>
+              <w:bottom w:type="dxa" w:w="90"/>
+              <w:right w:type="dxa" w:w="110"/>
+            </w:tcMar>
+            <w:vAlign w:val="center"/>
+          </w:tcPr>
+          <w:p>
+            <w:r>
+              <w:rPr>
+                <w:rFonts w:ascii="Calibri" w:cs="Calibri" w:eastAsia="Calibri" w:hAnsi="Calibri"/>
+                <w:b w:val="false"/>
+                <w:bCs w:val="false"/>
+                <w:color w:val="1A1A1A"/>
+                <w:sz w:val="19"/>
+                <w:szCs w:val="19"/>
+              </w:rPr>
+              <w:t>The “cost of doing nothing vs. acting” chart's Y-axis upper bound recalculated on every checkbox toggle, so unticking a measure could shrink the axis ceiling along with the line — making the line look just as tall, or taller, right after removing something. Fixed by fixing the ceiling against the full candidate set (every measure, ticked or not), so only the line moves, never the axis.</w:t>
+            </w:r>
+          </w:p>
+        </w:tc>
+      </w:tr>
+      <w:tr>
+        <w:tc>
+          <w:tcPr>
+            <w:tcW w:type="dxa" w:w="700"/>
+            <w:tcMar>
+              <w:top w:type="dxa" w:w="90"/>
+              <w:left w:type="dxa" w:w="110"/>
+              <w:bottom w:type="dxa" w:w="90"/>
+              <w:right w:type="dxa" w:w="110"/>
+            </w:tcMar>
+            <w:vAlign w:val="center"/>
+          </w:tcPr>
+          <w:p>
+            <w:r>
+              <w:rPr>
+                <w:rFonts w:ascii="Calibri" w:cs="Calibri" w:eastAsia="Calibri" w:hAnsi="Calibri"/>
+                <w:b w:val="false"/>
+                <w:bCs w:val="false"/>
+                <w:color w:val="1A1A1A"/>
+                <w:sz w:val="19"/>
+                <w:szCs w:val="19"/>
+              </w:rPr>
+              <w:t>M8</w:t>
+            </w:r>
+          </w:p>
+        </w:tc>
+        <w:tc>
+          <w:tcPr>
+            <w:tcW w:type="dxa" w:w="1100"/>
+            <w:tcMar>
+              <w:top w:type="dxa" w:w="90"/>
+              <w:left w:type="dxa" w:w="110"/>
+              <w:bottom w:type="dxa" w:w="90"/>
+              <w:right w:type="dxa" w:w="110"/>
+            </w:tcMar>
+            <w:vAlign w:val="center"/>
+          </w:tcPr>
+          <w:p>
+            <w:r>
+              <w:rPr>
+                <w:rFonts w:ascii="Calibri" w:cs="Calibri" w:eastAsia="Calibri" w:hAnsi="Calibri"/>
+                <w:b w:val="false"/>
+                <w:bCs w:val="false"/>
+                <w:color w:val="1A1A1A"/>
+                <w:sz w:val="19"/>
+                <w:szCs w:val="19"/>
+              </w:rPr>
+              <w:t>Moderate</w:t>
+            </w:r>
+          </w:p>
+        </w:tc>
+        <w:tc>
+          <w:tcPr>
+            <w:tcW w:type="dxa" w:w="2600"/>
+            <w:tcMar>
+              <w:top w:type="dxa" w:w="90"/>
+              <w:left w:type="dxa" w:w="110"/>
+              <w:bottom w:type="dxa" w:w="90"/>
+              <w:right w:type="dxa" w:w="110"/>
+            </w:tcMar>
+            <w:vAlign w:val="center"/>
+          </w:tcPr>
+          <w:p>
+            <w:r>
+              <w:rPr>
+                <w:rFonts w:ascii="Calibri" w:cs="Calibri" w:eastAsia="Calibri" w:hAnsi="Calibri"/>
+                <w:b w:val="false"/>
+                <w:bCs w:val="false"/>
+                <w:color w:val="1A1A1A"/>
+                <w:sz w:val="19"/>
+                <w:szCs w:val="19"/>
+              </w:rPr>
+              <w:t>Tied Top-3 measures silently dropped one arbitrarily</w:t>
+            </w:r>
+          </w:p>
+        </w:tc>
+        <w:tc>
+          <w:tcPr>
+            <w:tcW w:type="dxa" w:w="5200"/>
+            <w:tcMar>
+              <w:top w:type="dxa" w:w="90"/>
+              <w:left w:type="dxa" w:w="110"/>
+              <w:bottom w:type="dxa" w:w="90"/>
+              <w:right w:type="dxa" w:w="110"/>
+            </w:tcMar>
+            <w:vAlign w:val="center"/>
+          </w:tcPr>
+          <w:p>
+            <w:r>
+              <w:rPr>
+                <w:rFonts w:ascii="Calibri" w:cs="Calibri" w:eastAsia="Calibri" w:hAnsi="Calibri"/>
+                <w:b w:val="false"/>
+                <w:bCs w:val="false"/>
+                <w:color w:val="1A1A1A"/>
+                <w:sz w:val="19"/>
+                <w:szCs w:val="19"/>
+              </w:rPr>
+              <w:t>Two measures can land on the exact same payback by construction (same end-use, cost tier, and saving range — not a rounding coincidence), and the ranking logic picked one over the other via array order with no explanation. Fixed by dense-ranking instead: tied measures now share the same rank (e.g. two “#3 recommended” badges), shown consistently across the results hero, the in-depth breakdown, and the interactive checklist.</w:t>
+            </w:r>
+          </w:p>
+        </w:tc>
+      </w:tr>
+      <w:tr>
+        <w:tc>
+          <w:tcPr>
+            <w:tcW w:type="dxa" w:w="700"/>
+            <w:shd w:fill="F2F5F1" w:val="clear"/>
+            <w:tcMar>
+              <w:top w:type="dxa" w:w="90"/>
+              <w:left w:type="dxa" w:w="110"/>
+              <w:bottom w:type="dxa" w:w="90"/>
+              <w:right w:type="dxa" w:w="110"/>
+            </w:tcMar>
+            <w:vAlign w:val="center"/>
+          </w:tcPr>
+          <w:p>
+            <w:r>
+              <w:rPr>
+                <w:rFonts w:ascii="Calibri" w:cs="Calibri" w:eastAsia="Calibri" w:hAnsi="Calibri"/>
+                <w:b w:val="false"/>
+                <w:bCs w:val="false"/>
+                <w:color w:val="1A1A1A"/>
+                <w:sz w:val="19"/>
+                <w:szCs w:val="19"/>
+              </w:rPr>
+              <w:t>M9</w:t>
+            </w:r>
+          </w:p>
+        </w:tc>
+        <w:tc>
+          <w:tcPr>
+            <w:tcW w:type="dxa" w:w="1100"/>
+            <w:shd w:fill="F2F5F1" w:val="clear"/>
+            <w:tcMar>
+              <w:top w:type="dxa" w:w="90"/>
+              <w:left w:type="dxa" w:w="110"/>
+              <w:bottom w:type="dxa" w:w="90"/>
+              <w:right w:type="dxa" w:w="110"/>
+            </w:tcMar>
+            <w:vAlign w:val="center"/>
+          </w:tcPr>
+          <w:p>
+            <w:r>
+              <w:rPr>
+                <w:rFonts w:ascii="Calibri" w:cs="Calibri" w:eastAsia="Calibri" w:hAnsi="Calibri"/>
+                <w:b w:val="false"/>
+                <w:bCs w:val="false"/>
+                <w:color w:val="1A1A1A"/>
+                <w:sz w:val="19"/>
+                <w:szCs w:val="19"/>
+              </w:rPr>
+              <w:t>Moderate</w:t>
+            </w:r>
+          </w:p>
+        </w:tc>
+        <w:tc>
+          <w:tcPr>
+            <w:tcW w:type="dxa" w:w="2600"/>
+            <w:shd w:fill="F2F5F1" w:val="clear"/>
+            <w:tcMar>
+              <w:top w:type="dxa" w:w="90"/>
+              <w:left w:type="dxa" w:w="110"/>
+              <w:bottom w:type="dxa" w:w="90"/>
+              <w:right w:type="dxa" w:w="110"/>
+            </w:tcMar>
+            <w:vAlign w:val="center"/>
+          </w:tcPr>
+          <w:p>
+            <w:r>
+              <w:rPr>
+                <w:rFonts w:ascii="Calibri" w:cs="Calibri" w:eastAsia="Calibri" w:hAnsi="Calibri"/>
+                <w:b w:val="false"/>
+                <w:bCs w:val="false"/>
+                <w:color w:val="1A1A1A"/>
+                <w:sz w:val="19"/>
+                <w:szCs w:val="19"/>
+              </w:rPr>
+              <w:t>Broken-looking chart for a sector with no ECM catalog data</w:t>
+            </w:r>
+          </w:p>
+        </w:tc>
+        <w:tc>
+          <w:tcPr>
+            <w:tcW w:type="dxa" w:w="5200"/>
+            <w:shd w:fill="F2F5F1" w:val="clear"/>
+            <w:tcMar>
+              <w:top w:type="dxa" w:w="90"/>
+              <w:left w:type="dxa" w:w="110"/>
+              <w:bottom w:type="dxa" w:w="90"/>
+              <w:right w:type="dxa" w:w="110"/>
+            </w:tcMar>
+            <w:vAlign w:val="center"/>
+          </w:tcPr>
+          <w:p>
+            <w:r>
+              <w:rPr>
+                <w:rFonts w:ascii="Calibri" w:cs="Calibri" w:eastAsia="Calibri" w:hAnsi="Calibri"/>
+                <w:b w:val="false"/>
+                <w:bCs w:val="false"/>
+                <w:color w:val="1A1A1A"/>
+                <w:sz w:val="19"/>
+                <w:szCs w:val="19"/>
+              </w:rPr>
+              <w:t>Selecting the “Other” sector (no sourced Energy Conservation Measure data in this tool) left the chart's numeric range genuinely at zero, which combined with the M7 fix produced an axis whose every tick rounded to “0k” — technically correct, but read as broken. Fixed with an explicit empty-state message explaining why, instead of a degenerate axis.</w:t>
+            </w:r>
+          </w:p>
+        </w:tc>
+      </w:tr>
     </w:tbl>
     <w:p>
       <w:pPr>
@@ -2470,7 +2784,7 @@
           <w:sz w:val="21"/>
           <w:szCs w:val="21"/>
         </w:rPr>
-        <w:t>Beyond usability testing, every emission factor, tariff, tax rate, grant figure, and ECM saving range used by the calculator is sourced from an authoritative published body (EMA, NEA/SEFR, MSE, SP Group, EnterpriseSG, BCA Green Mark, IPCC AR5, UK DESNZ/DEFRA, US EPA EEIO, ASHRAE, US DOE, ENERGY STAR) and stored in version-stamped JSON files under /data, each carrying an explicit source field and a proxy flag wherever a figure is an international stand-in rather than a Singapore-specific one. This is what allows every number EcoStruxure Value Advisor produces to survive the scrutiny described in Section 3.3 — see the full References list at the end of this report. Two examples from this build cycle: a 45-test automated suite added against the calculation engine caught a real, previously-unreachable-but-latent bug in the carbon-tax rate function (a pre-2024 calendar year fell through to the wrong legislated rate); and a sector energy-intensity benchmark (Office/Professional Services, Hospitality, Retail, Healthcare) that an earlier research pass had left unresolved — two WebSearch passes returned internally conflicting figures — was corrected by going directly to BCA's own primary-source Building Energy Benchmarks spreadsheet rather than trusting secondary summaries.</w:t>
+        <w:t>Beyond usability testing, every emission factor, tariff, tax rate, grant figure, and ECM saving range used by the calculator is sourced from an authoritative published body (EMA, NEA/SEFR, MSE, SP Group, EnterpriseSG, BCA Green Mark, IPCC AR5, UK DESNZ/DEFRA, US EPA EEIO, ASHRAE, US DOE, ENERGY STAR) and stored in version-stamped JSON files under /data, each carrying an explicit source field and a proxy flag wherever a figure is an international stand-in rather than a Singapore-specific one. This is what allows every number EcoStruxure Value Advisor produces to survive the scrutiny described in Section 3.3 — see the full References list at the end of this report. Three examples of the automated test suite (now 49 tests against the calculation engine, grown from 45 earlier in the build) catching real bugs before they reached a user: a previously-unreachable-but-latent bug in the carbon-tax rate function (a pre-2024 calendar year fell through to the wrong legislated rate); a sector energy-intensity benchmark (Office/Professional Services, Hospitality, Retail, Healthcare) that an earlier research pass had left unresolved — two WebSearch passes returned internally conflicting figures — corrected by going directly to BCA's own primary-source Building Energy Benchmarks spreadsheet rather than trusting secondary summaries; and two Top-3 recommended measures that turned out to share an identical payback by construction (same end-use, cost tier, and saving range) — a regression test now locks in that both are credited with the same rank rather than one arbitrarily bumping the other out of the recommendation.</w:t>
       </w:r>
     </w:p>
     <w:p>
@@ -4855,7 +5169,7 @@
           <w:sz w:val="21"/>
           <w:szCs w:val="21"/>
         </w:rPr>
-        <w:t>The most direct way to demonstrate this tool is to apply it to the reader's own organisation, not a synthetic example. Using only public information — company press coverage, commercial property records, and BCA Green Mark certifications — the calculator's own engine was run, unmodified, against researched Singapore HQ profiles for Thales (Ayer Rajah Crescent, Manufacturing/MRO), Monee (Sea Ltd's digital financial services arm, Rochester Commons), and Garena (Sea Ltd's digital entertainment arm, Galaxis) — producing three full illustration reports. Each one leads with an executive summary; discloses every assumption explicitly, including a dedicated Scope 1, 2 &amp; 3 estimates table before any result is shown; names every measure behind its saving-rate percentage rather than citing an unlabelled figure; and closes with a dedicated Limitations section, including an explicit reconciliation note covering the one place these reports' own numbers don't sum arithmetically — individual measures' $/year figures are each computed independently, while the headline rate applies the calculator's proper diminishing-returns combination across measures sharing a building area, so the two are expected to differ and both are labelled accordingly. These reports are included alongside this one.</w:t>
+        <w:t>The most direct way to demonstrate this tool is to apply it to the reader's own organisation, not a synthetic example. Using only public information — company press coverage, commercial property records, and BCA Green Mark certifications — the calculator's own engine was run, unmodified, against researched Singapore HQ profiles for Thales (Ayer Rajah Crescent, Manufacturing/MRO), Monee (Sea Ltd's digital financial services arm, Rochester Commons), and Garena (Sea Ltd's digital entertainment arm, Galaxis) — producing three full illustration reports. Each one leads with an executive summary; discloses every assumption explicitly, including a dedicated Scope 1, 2 &amp; 3 estimates table before any result is shown; names every measure behind its saving-rate percentage rather than citing an unlabelled figure; and closes with a dedicated Limitations section, including an explicit reconciliation note covering the one place these reports' own numbers don't sum arithmetically — individual measures' $/year figures are each computed independently, while the headline rate applies the calculator's proper diminishing-returns combination across measures sharing a building area, so the two are expected to differ and both are labelled accordingly. For Monee and Garena — both tenants in landlord-managed, BCA Green Mark Platinum buildings (Rochester Commons and Galaxis respectively) — a further refinement was applied: base-building plant measures the tenant doesn't control (chiller replacement, chiller-plant optimisation, plant-room ventilation) are shown in each report's full measure breakdown for completeness, but excluded from the headline savings rate and dollar figures, which are restricted to measures a tenant can actually act on directly. This moved the initial figure from an uncredible 37% on an already-certified-efficient building neither company controls the plant of, down to a defensible 28% — using the same calculation engine, with no numbers hand-edited. These reports are included alongside this one.</w:t>
       </w:r>
     </w:p>
     <w:p>

</xml_diff>